<commit_message>
style(bbgd): bớt 1 dòng "……" ở mục Phần tạo ảnh (5 -> 4) trong template BM26
Co-Authored-By: Claude Opus 4.8 <noreply@anthropic.com>
</commit_message>
<xml_diff>
--- a/src/lib/report/bbgd-bm26.docx
+++ b/src/lib/report/bbgd-bm26.docx
@@ -568,17 +568,6 @@
           <w:iCs/>
         </w:rPr>
         <w:t>+ Phần tạo ảnh (Dàn quang, cụm laser, Cụm trống, cấp mực, cụm từ, chuyển in,…):</w:t>
-      </w:r>
-    </w:p>
-    <w:p>
-      <w:pPr>
-        <w:spacing w:after="0" w:line="360" w:lineRule="auto"/>
-      </w:pPr>
-      <w:r>
-        <w:t>…</w:t>
-      </w:r>
-      <w:r>
-        <w:t>……………………………………………………………………………………………………</w:t>
       </w:r>
     </w:p>
     <w:p>

</xml_diff>